<commit_message>
Issue API Gateway standard v1.1 and start v1.2
Version 1.1 (archived in versions/v1.1):
- keep rate limiting, caching and schema validation fully optional per
  API, recommended where they help
- define consumer configuration held in Git (identity, entitlements,
  rate limits; never credentials)
- add the Security Managers role as approver of exceptions
- make the security core mandatory (C2B/B2B tokens, no long-lived
  credential on every request, no undocumented manual production config)
- update README and PLAN.md to match; Appendix C reduced to one open issue

Version 1.2: version bumped and revision-history entry added; working
copy rebuilt, no content changes yet.

Co-Authored-By: Claude Sonnet 5 <noreply@anthropic.com>
</commit_message>
<xml_diff>
--- a/apps/api-gateway-doc/API_Gateway_Enterprise_Architecture_Standard.docx
+++ b/apps/api-gateway-doc/API_Gateway_Enterprise_Architecture_Standard.docx
@@ -101,7 +101,7 @@
               <w:pStyle w:val="TableText"/>
             </w:pPr>
             <w:r>
-              <w:t>1.0</w:t>
+              <w:t>1.2</w:t>
             </w:r>
           </w:p>
         </w:tc>
@@ -394,7 +394,7 @@
               <w:pStyle w:val="TableText"/>
             </w:pPr>
             <w:r>
-              <w:t>1.0</w:t>
+              <w:t>1.2</w:t>
             </w:r>
           </w:p>
         </w:tc>
@@ -789,6 +789,126 @@
               <w:pStyle w:val="TableText"/>
             </w:pPr>
             <w:r>
+              <w:t>1.2</w:t>
+            </w:r>
+          </w:p>
+        </w:tc>
+        <w:tc>
+          <w:tcPr>
+            <w:tcW w:type="dxa" w:w="1587"/>
+          </w:tcPr>
+          <w:p>
+            <w:pPr>
+              <w:pStyle w:val="TableText"/>
+            </w:pPr>
+            <w:r>
+              <w:t>2026-09-21</w:t>
+            </w:r>
+          </w:p>
+        </w:tc>
+        <w:tc>
+          <w:tcPr>
+            <w:tcW w:type="dxa" w:w="2041"/>
+          </w:tcPr>
+          <w:p>
+            <w:pPr>
+              <w:pStyle w:val="TableText"/>
+            </w:pPr>
+            <w:r>
+              <w:rPr>
+                <w:highlight w:val="yellow"/>
+              </w:rPr>
+              <w:t>[Author]</w:t>
+            </w:r>
+          </w:p>
+        </w:tc>
+        <w:tc>
+          <w:tcPr>
+            <w:tcW w:type="dxa" w:w="4195"/>
+          </w:tcPr>
+          <w:p>
+            <w:pPr>
+              <w:pStyle w:val="TableText"/>
+            </w:pPr>
+            <w:r>
+              <w:t>In preparation (draft). Summary of changes since 1.1 to be completed when issued.</w:t>
+            </w:r>
+          </w:p>
+        </w:tc>
+      </w:tr>
+      <w:tr>
+        <w:trPr>
+          <w:cantSplit/>
+        </w:trPr>
+        <w:tc>
+          <w:tcPr>
+            <w:tcW w:type="dxa" w:w="1247"/>
+          </w:tcPr>
+          <w:p>
+            <w:pPr>
+              <w:pStyle w:val="TableText"/>
+            </w:pPr>
+            <w:r>
+              <w:t>1.1</w:t>
+            </w:r>
+          </w:p>
+        </w:tc>
+        <w:tc>
+          <w:tcPr>
+            <w:tcW w:type="dxa" w:w="1587"/>
+          </w:tcPr>
+          <w:p>
+            <w:pPr>
+              <w:pStyle w:val="TableText"/>
+            </w:pPr>
+            <w:r>
+              <w:t>2026-09-21</w:t>
+            </w:r>
+          </w:p>
+        </w:tc>
+        <w:tc>
+          <w:tcPr>
+            <w:tcW w:type="dxa" w:w="2041"/>
+          </w:tcPr>
+          <w:p>
+            <w:pPr>
+              <w:pStyle w:val="TableText"/>
+            </w:pPr>
+            <w:r>
+              <w:rPr>
+                <w:highlight w:val="yellow"/>
+              </w:rPr>
+              <w:t>[Author]</w:t>
+            </w:r>
+          </w:p>
+        </w:tc>
+        <w:tc>
+          <w:tcPr>
+            <w:tcW w:type="dxa" w:w="4195"/>
+          </w:tcPr>
+          <w:p>
+            <w:pPr>
+              <w:pStyle w:val="TableText"/>
+            </w:pPr>
+            <w:r>
+              <w:t>Draft. Settles three open issues (all three optional capabilities stay optional per API; consumer configuration in Git defined; Security Managers approve exceptions) and makes the security core mandatory.</w:t>
+            </w:r>
+          </w:p>
+        </w:tc>
+      </w:tr>
+      <w:tr>
+        <w:trPr>
+          <w:cantSplit/>
+        </w:trPr>
+        <w:tc>
+          <w:tcPr>
+            <w:tcW w:type="dxa" w:w="1247"/>
+          </w:tcPr>
+          <w:p>
+            <w:pPr>
+              <w:pStyle w:val="TableText"/>
+            </w:pPr>
+            <w:r>
               <w:t>1.0</w:t>
             </w:r>
           </w:p>
@@ -3755,6 +3875,50 @@
               <w:rPr>
                 <w:b/>
               </w:rPr>
+              <w:t>Security Managers</w:t>
+            </w:r>
+          </w:p>
+        </w:tc>
+        <w:tc>
+          <w:tcPr>
+            <w:tcW w:type="dxa" w:w="6690"/>
+          </w:tcPr>
+          <w:p>
+            <w:pPr>
+              <w:pStyle w:val="TableText"/>
+            </w:pPr>
+            <w:r>
+              <w:t xml:space="preserve">The team </w:t>
+            </w:r>
+            <w:r>
+              <w:rPr>
+                <w:highlight w:val="yellow"/>
+              </w:rPr>
+              <w:t>[team name]</w:t>
+            </w:r>
+            <w:r>
+              <w:t xml:space="preserve"> designated by the organization to approve exceptions to this document.</w:t>
+            </w:r>
+          </w:p>
+        </w:tc>
+      </w:tr>
+      <w:tr>
+        <w:trPr>
+          <w:cantSplit/>
+        </w:trPr>
+        <w:tc>
+          <w:tcPr>
+            <w:tcW w:type="dxa" w:w="2381"/>
+            <w:shd w:val="clear" w:color="auto" w:fill="F2F5FA"/>
+          </w:tcPr>
+          <w:p>
+            <w:pPr>
+              <w:pStyle w:val="TableText"/>
+            </w:pPr>
+            <w:r>
+              <w:rPr>
+                <w:b/>
+              </w:rPr>
               <w:t>Site</w:t>
             </w:r>
           </w:p>
@@ -5581,6 +5745,41 @@
           </w:p>
         </w:tc>
       </w:tr>
+      <w:tr>
+        <w:trPr>
+          <w:cantSplit/>
+        </w:trPr>
+        <w:tc>
+          <w:tcPr>
+            <w:tcW w:type="dxa" w:w="2381"/>
+            <w:shd w:val="clear" w:color="auto" w:fill="F2F5FA"/>
+          </w:tcPr>
+          <w:p>
+            <w:pPr>
+              <w:pStyle w:val="TableText"/>
+            </w:pPr>
+            <w:r>
+              <w:rPr>
+                <w:b/>
+              </w:rPr>
+              <w:t>Security Managers</w:t>
+            </w:r>
+          </w:p>
+        </w:tc>
+        <w:tc>
+          <w:tcPr>
+            <w:tcW w:type="dxa" w:w="6690"/>
+          </w:tcPr>
+          <w:p>
+            <w:pPr>
+              <w:pStyle w:val="TableText"/>
+            </w:pPr>
+            <w:r>
+              <w:t>Approve exceptions to this document (see Section 11.6).</w:t>
+            </w:r>
+          </w:p>
+        </w:tc>
+      </w:tr>
     </w:tbl>
     <w:p>
       <w:pPr>
@@ -6893,7 +7092,7 @@
         <w:rPr>
           <w:b/>
         </w:rPr>
-        <w:t>should</w:t>
+        <w:t>shall</w:t>
       </w:r>
       <w:r>
         <w:t xml:space="preserve"> authenticate through the organization's Identity Provider.</w:t>
@@ -6922,7 +7121,7 @@
         <w:rPr>
           <w:b/>
         </w:rPr>
-        <w:t>should</w:t>
+        <w:t>shall</w:t>
       </w:r>
       <w:r>
         <w:t xml:space="preserve"> use short-lived access tokens issued by the organization's Identity Provider.</w:t>
@@ -7094,7 +7293,7 @@
         <w:rPr>
           <w:b/>
         </w:rPr>
-        <w:t>should</w:t>
+        <w:t>shall</w:t>
       </w:r>
       <w:r>
         <w:t xml:space="preserve"> use a client credential to obtain a short-lived access token, and then present that access token for API access.</w:t>
@@ -7123,7 +7322,7 @@
         <w:rPr>
           <w:b/>
         </w:rPr>
-        <w:t>should not</w:t>
+        <w:t>shall not</w:t>
       </w:r>
       <w:r>
         <w:t xml:space="preserve"> be used as the API access credential for every request.</w:t>
@@ -7152,7 +7351,7 @@
         <w:rPr>
           <w:b/>
         </w:rPr>
-        <w:t>should not</w:t>
+        <w:t>shall not</w:t>
       </w:r>
       <w:r>
         <w:t xml:space="preserve"> be continuously transmitted across the network.</w:t>
@@ -9346,10 +9545,10 @@
         <w:rPr>
           <w:b/>
         </w:rPr>
-        <w:t>may</w:t>
-      </w:r>
-      <w:r>
-        <w:t xml:space="preserve"> be enabled for an API where appropriate.</w:t>
+        <w:t>should</w:t>
+      </w:r>
+      <w:r>
+        <w:t xml:space="preserve"> be enabled for an API where it can help protect the API or its backend.</w:t>
       </w:r>
     </w:p>
     <w:p>
@@ -9363,7 +9562,7 @@
         <w:t xml:space="preserve">Note. </w:t>
       </w:r>
       <w:r>
-        <w:t>Rate limiting is not required to be enabled for every API.</w:t>
+        <w:t>Enabling rate limiting is optional. It is not required for every API.</w:t>
       </w:r>
     </w:p>
     <w:p>
@@ -9648,7 +9847,21 @@
         <w:t>should</w:t>
       </w:r>
       <w:r>
-        <w:t xml:space="preserve"> be used only where it is safe and appropriate.</w:t>
+        <w:t xml:space="preserve"> be used where it can help and where it is safe and appropriate.</w:t>
+      </w:r>
+    </w:p>
+    <w:p>
+      <w:pPr>
+        <w:pStyle w:val="Note"/>
+      </w:pPr>
+      <w:r>
+        <w:rPr>
+          <w:b/>
+        </w:rPr>
+        <w:t xml:space="preserve">Note. </w:t>
+      </w:r>
+      <w:r>
+        <w:t>Enabling caching is optional. It is not required for every API.</w:t>
       </w:r>
     </w:p>
     <w:p>
@@ -10015,6 +10228,49 @@
           <w:sz w:val="19"/>
         </w:rPr>
         <w:t>GW-POL-013</w:t>
+      </w:r>
+      <w:r>
+        <w:tab/>
+      </w:r>
+      <w:r>
+        <w:t xml:space="preserve">Schema validation </w:t>
+      </w:r>
+      <w:r>
+        <w:rPr>
+          <w:b/>
+        </w:rPr>
+        <w:t>should</w:t>
+      </w:r>
+      <w:r>
+        <w:t xml:space="preserve"> be enabled for an API where it can help protect its backend.</w:t>
+      </w:r>
+    </w:p>
+    <w:p>
+      <w:pPr>
+        <w:pStyle w:val="Note"/>
+      </w:pPr>
+      <w:r>
+        <w:rPr>
+          <w:b/>
+        </w:rPr>
+        <w:t xml:space="preserve">Note. </w:t>
+      </w:r>
+      <w:r>
+        <w:t>Enabling schema validation is optional. It is not required for every API.</w:t>
+      </w:r>
+    </w:p>
+    <w:p>
+      <w:pPr>
+        <w:pStyle w:val="Requirement"/>
+        <w:keepNext w:val="0"/>
+      </w:pPr>
+      <w:r>
+        <w:rPr>
+          <w:b/>
+          <w:color w:val="1F3864"/>
+          <w:sz w:val="19"/>
+        </w:rPr>
+        <w:t>GW-POL-014</w:t>
       </w:r>
       <w:r>
         <w:tab/>
@@ -11096,7 +11352,21 @@
         <w:ind w:left="1928" w:hanging="283"/>
       </w:pPr>
       <w:r>
-        <w:t>Consumer configuration where appropriate</w:t>
+        <w:t>Consumer configuration: consumer identity, entitlements (APIs and operations) and rate limits</w:t>
+      </w:r>
+    </w:p>
+    <w:p>
+      <w:pPr>
+        <w:pStyle w:val="Note"/>
+      </w:pPr>
+      <w:r>
+        <w:rPr>
+          <w:b/>
+        </w:rPr>
+        <w:t xml:space="preserve">Note. </w:t>
+      </w:r>
+      <w:r>
+        <w:t>Consumer credentials are never held in Git. See Section 8.3.</w:t>
       </w:r>
     </w:p>
     <w:p>
@@ -11334,7 +11604,7 @@
         <w:rPr>
           <w:b/>
         </w:rPr>
-        <w:t>should not</w:t>
+        <w:t>shall not</w:t>
       </w:r>
       <w:r>
         <w:t xml:space="preserve"> depend on undocumented manual configuration.</w:t>
@@ -13813,7 +14083,7 @@
         <w:ind w:left="1928" w:hanging="283"/>
       </w:pPr>
       <w:r>
-        <w:t>An appropriate approval.</w:t>
+        <w:t>Approval by the Security Managers.</w:t>
       </w:r>
     </w:p>
     <w:p>
@@ -17015,7 +17285,7 @@
               <w:pStyle w:val="TableText"/>
             </w:pPr>
             <w:r>
-              <w:t>6</w:t>
+              <w:t>11</w:t>
             </w:r>
           </w:p>
         </w:tc>
@@ -17028,7 +17298,7 @@
               <w:pStyle w:val="TableText"/>
             </w:pPr>
             <w:r>
-              <w:t>6</w:t>
+              <w:t>1</w:t>
             </w:r>
           </w:p>
         </w:tc>
@@ -17098,20 +17368,20 @@
               <w:pStyle w:val="TableText"/>
             </w:pPr>
             <w:r>
+              <w:t>4</w:t>
+            </w:r>
+          </w:p>
+        </w:tc>
+        <w:tc>
+          <w:tcPr>
+            <w:tcW w:type="dxa" w:w="1134"/>
+          </w:tcPr>
+          <w:p>
+            <w:pPr>
+              <w:pStyle w:val="TableText"/>
+            </w:pPr>
+            <w:r>
               <w:t>3</w:t>
-            </w:r>
-          </w:p>
-        </w:tc>
-        <w:tc>
-          <w:tcPr>
-            <w:tcW w:type="dxa" w:w="1134"/>
-          </w:tcPr>
-          <w:p>
-            <w:pPr>
-              <w:pStyle w:val="TableText"/>
-            </w:pPr>
-            <w:r>
-              <w:t>4</w:t>
             </w:r>
           </w:p>
         </w:tc>
@@ -17168,7 +17438,7 @@
               <w:pStyle w:val="TableText"/>
             </w:pPr>
             <w:r>
-              <w:t>4</w:t>
+              <w:t>5</w:t>
             </w:r>
           </w:p>
         </w:tc>
@@ -17194,7 +17464,7 @@
               <w:pStyle w:val="TableText"/>
             </w:pPr>
             <w:r>
-              <w:t>13</w:t>
+              <w:t>14</w:t>
             </w:r>
           </w:p>
         </w:tc>
@@ -17295,20 +17565,20 @@
               <w:pStyle w:val="TableText"/>
             </w:pPr>
             <w:r>
+              <w:t>5</w:t>
+            </w:r>
+          </w:p>
+        </w:tc>
+        <w:tc>
+          <w:tcPr>
+            <w:tcW w:type="dxa" w:w="1474"/>
+          </w:tcPr>
+          <w:p>
+            <w:pPr>
+              <w:pStyle w:val="TableText"/>
+            </w:pPr>
+            <w:r>
               <w:t>4</w:t>
-            </w:r>
-          </w:p>
-        </w:tc>
-        <w:tc>
-          <w:tcPr>
-            <w:tcW w:type="dxa" w:w="1474"/>
-          </w:tcPr>
-          <w:p>
-            <w:pPr>
-              <w:pStyle w:val="TableText"/>
-            </w:pPr>
-            <w:r>
-              <w:t>5</w:t>
             </w:r>
           </w:p>
         </w:tc>
@@ -17721,7 +17991,7 @@
               <w:rPr>
                 <w:b/>
               </w:rPr>
-              <w:t>62</w:t>
+              <w:t>68</w:t>
             </w:r>
           </w:p>
         </w:tc>
@@ -17737,7 +18007,7 @@
               <w:rPr>
                 <w:b/>
               </w:rPr>
-              <w:t>53</w:t>
+              <w:t>49</w:t>
             </w:r>
           </w:p>
         </w:tc>
@@ -17753,7 +18023,7 @@
               <w:rPr>
                 <w:b/>
               </w:rPr>
-              <w:t>13</w:t>
+              <w:t>12</w:t>
             </w:r>
           </w:p>
         </w:tc>
@@ -17769,7 +18039,7 @@
               <w:rPr>
                 <w:b/>
               </w:rPr>
-              <w:t>128</w:t>
+              <w:t>129</w:t>
             </w:r>
           </w:p>
         </w:tc>
@@ -18748,7 +19018,7 @@
               <w:pStyle w:val="TableText"/>
             </w:pPr>
             <w:r>
-              <w:t>Recommended</w:t>
+              <w:t>Mandatory</w:t>
             </w:r>
           </w:p>
         </w:tc>
@@ -18796,7 +19066,7 @@
               <w:pStyle w:val="TableText"/>
             </w:pPr>
             <w:r>
-              <w:t>Recommended</w:t>
+              <w:t>Mandatory</w:t>
             </w:r>
           </w:p>
         </w:tc>
@@ -18940,7 +19210,7 @@
               <w:pStyle w:val="TableText"/>
             </w:pPr>
             <w:r>
-              <w:t>Recommended</w:t>
+              <w:t>Mandatory</w:t>
             </w:r>
           </w:p>
         </w:tc>
@@ -18988,7 +19258,7 @@
               <w:pStyle w:val="TableText"/>
             </w:pPr>
             <w:r>
-              <w:t>Recommended</w:t>
+              <w:t>Mandatory</w:t>
             </w:r>
           </w:p>
         </w:tc>
@@ -19036,7 +19306,7 @@
               <w:pStyle w:val="TableText"/>
             </w:pPr>
             <w:r>
-              <w:t>Recommended</w:t>
+              <w:t>Mandatory</w:t>
             </w:r>
           </w:p>
         </w:tc>
@@ -20092,7 +20362,7 @@
               <w:pStyle w:val="TableText"/>
             </w:pPr>
             <w:r>
-              <w:t>Optional</w:t>
+              <w:t>Recommended</w:t>
             </w:r>
           </w:p>
         </w:tc>
@@ -20738,7 +21008,7 @@
               <w:rPr>
                 <w:b/>
               </w:rPr>
-              <w:t>GW-LCY-001</w:t>
+              <w:t>GW-POL-014</w:t>
             </w:r>
           </w:p>
         </w:tc>
@@ -20751,7 +21021,7 @@
               <w:pStyle w:val="TableText"/>
             </w:pPr>
             <w:r>
-              <w:t>7.1 API contract</w:t>
+              <w:t>6.3 Schema validation</w:t>
             </w:r>
           </w:p>
         </w:tc>
@@ -20764,7 +21034,7 @@
               <w:pStyle w:val="TableText"/>
             </w:pPr>
             <w:r>
-              <w:t>Mandatory</w:t>
+              <w:t>Recommended</w:t>
             </w:r>
           </w:p>
         </w:tc>
@@ -20786,7 +21056,7 @@
               <w:rPr>
                 <w:b/>
               </w:rPr>
-              <w:t>GW-LCY-002</w:t>
+              <w:t>GW-LCY-001</w:t>
             </w:r>
           </w:p>
         </w:tc>
@@ -20812,7 +21082,7 @@
               <w:pStyle w:val="TableText"/>
             </w:pPr>
             <w:r>
-              <w:t>Recommended</w:t>
+              <w:t>Mandatory</w:t>
             </w:r>
           </w:p>
         </w:tc>
@@ -20834,7 +21104,7 @@
               <w:rPr>
                 <w:b/>
               </w:rPr>
-              <w:t>GW-LCY-003</w:t>
+              <w:t>GW-LCY-002</w:t>
             </w:r>
           </w:p>
         </w:tc>
@@ -20882,7 +21152,7 @@
               <w:rPr>
                 <w:b/>
               </w:rPr>
-              <w:t>GW-LCY-004</w:t>
+              <w:t>GW-LCY-003</w:t>
             </w:r>
           </w:p>
         </w:tc>
@@ -20895,7 +21165,7 @@
               <w:pStyle w:val="TableText"/>
             </w:pPr>
             <w:r>
-              <w:t>7.2 API lifecycle</w:t>
+              <w:t>7.1 API contract</w:t>
             </w:r>
           </w:p>
         </w:tc>
@@ -20908,7 +21178,7 @@
               <w:pStyle w:val="TableText"/>
             </w:pPr>
             <w:r>
-              <w:t>Mandatory</w:t>
+              <w:t>Recommended</w:t>
             </w:r>
           </w:p>
         </w:tc>
@@ -20930,7 +21200,7 @@
               <w:rPr>
                 <w:b/>
               </w:rPr>
-              <w:t>GW-LCY-005</w:t>
+              <w:t>GW-LCY-004</w:t>
             </w:r>
           </w:p>
         </w:tc>
@@ -20978,7 +21248,7 @@
               <w:rPr>
                 <w:b/>
               </w:rPr>
-              <w:t>GW-LCY-006</w:t>
+              <w:t>GW-LCY-005</w:t>
             </w:r>
           </w:p>
         </w:tc>
@@ -20991,7 +21261,7 @@
               <w:pStyle w:val="TableText"/>
             </w:pPr>
             <w:r>
-              <w:t>7.3 Deprecation</w:t>
+              <w:t>7.2 API lifecycle</w:t>
             </w:r>
           </w:p>
         </w:tc>
@@ -21004,7 +21274,7 @@
               <w:pStyle w:val="TableText"/>
             </w:pPr>
             <w:r>
-              <w:t>Recommended</w:t>
+              <w:t>Mandatory</w:t>
             </w:r>
           </w:p>
         </w:tc>
@@ -21026,7 +21296,7 @@
               <w:rPr>
                 <w:b/>
               </w:rPr>
-              <w:t>GW-LCY-007</w:t>
+              <w:t>GW-LCY-006</w:t>
             </w:r>
           </w:p>
         </w:tc>
@@ -21039,7 +21309,7 @@
               <w:pStyle w:val="TableText"/>
             </w:pPr>
             <w:r>
-              <w:t>7.4 Consumer lifecycle</w:t>
+              <w:t>7.3 Deprecation</w:t>
             </w:r>
           </w:p>
         </w:tc>
@@ -21052,7 +21322,7 @@
               <w:pStyle w:val="TableText"/>
             </w:pPr>
             <w:r>
-              <w:t>Mandatory</w:t>
+              <w:t>Recommended</w:t>
             </w:r>
           </w:p>
         </w:tc>
@@ -21074,7 +21344,7 @@
               <w:rPr>
                 <w:b/>
               </w:rPr>
-              <w:t>GW-LCY-008</w:t>
+              <w:t>GW-LCY-007</w:t>
             </w:r>
           </w:p>
         </w:tc>
@@ -21087,7 +21357,7 @@
               <w:pStyle w:val="TableText"/>
             </w:pPr>
             <w:r>
-              <w:t>7.5 Developer Portal</w:t>
+              <w:t>7.4 Consumer lifecycle</w:t>
             </w:r>
           </w:p>
         </w:tc>
@@ -21122,7 +21392,7 @@
               <w:rPr>
                 <w:b/>
               </w:rPr>
-              <w:t>GW-LCY-009</w:t>
+              <w:t>GW-LCY-008</w:t>
             </w:r>
           </w:p>
         </w:tc>
@@ -21148,7 +21418,7 @@
               <w:pStyle w:val="TableText"/>
             </w:pPr>
             <w:r>
-              <w:t>Recommended</w:t>
+              <w:t>Mandatory</w:t>
             </w:r>
           </w:p>
         </w:tc>
@@ -21170,7 +21440,7 @@
               <w:rPr>
                 <w:b/>
               </w:rPr>
-              <w:t>GW-LCY-010</w:t>
+              <w:t>GW-LCY-009</w:t>
             </w:r>
           </w:p>
         </w:tc>
@@ -21218,7 +21488,7 @@
               <w:rPr>
                 <w:b/>
               </w:rPr>
-              <w:t>GW-LCY-011</w:t>
+              <w:t>GW-LCY-010</w:t>
             </w:r>
           </w:p>
         </w:tc>
@@ -21244,7 +21514,7 @@
               <w:pStyle w:val="TableText"/>
             </w:pPr>
             <w:r>
-              <w:t>Mandatory</w:t>
+              <w:t>Recommended</w:t>
             </w:r>
           </w:p>
         </w:tc>
@@ -21266,7 +21536,7 @@
               <w:rPr>
                 <w:b/>
               </w:rPr>
-              <w:t>GW-CFG-001</w:t>
+              <w:t>GW-LCY-011</w:t>
             </w:r>
           </w:p>
         </w:tc>
@@ -21279,7 +21549,7 @@
               <w:pStyle w:val="TableText"/>
             </w:pPr>
             <w:r>
-              <w:t>8.1 Git as the source of truth</w:t>
+              <w:t>7.5 Developer Portal</w:t>
             </w:r>
           </w:p>
         </w:tc>
@@ -21314,7 +21584,7 @@
               <w:rPr>
                 <w:b/>
               </w:rPr>
-              <w:t>GW-CFG-002</w:t>
+              <w:t>GW-CFG-001</w:t>
             </w:r>
           </w:p>
         </w:tc>
@@ -21362,7 +21632,7 @@
               <w:rPr>
                 <w:b/>
               </w:rPr>
-              <w:t>GW-CFG-003</w:t>
+              <w:t>GW-CFG-002</w:t>
             </w:r>
           </w:p>
         </w:tc>
@@ -21388,7 +21658,7 @@
               <w:pStyle w:val="TableText"/>
             </w:pPr>
             <w:r>
-              <w:t>Recommended</w:t>
+              <w:t>Mandatory</w:t>
             </w:r>
           </w:p>
         </w:tc>
@@ -21410,7 +21680,7 @@
               <w:rPr>
                 <w:b/>
               </w:rPr>
-              <w:t>GW-CFG-004</w:t>
+              <w:t>GW-CFG-003</w:t>
             </w:r>
           </w:p>
         </w:tc>
@@ -21423,7 +21693,7 @@
               <w:pStyle w:val="TableText"/>
             </w:pPr>
             <w:r>
-              <w:t>8.2 GitOps</w:t>
+              <w:t>8.1 Git as the source of truth</w:t>
             </w:r>
           </w:p>
         </w:tc>
@@ -21458,6 +21728,54 @@
               <w:rPr>
                 <w:b/>
               </w:rPr>
+              <w:t>GW-CFG-004</w:t>
+            </w:r>
+          </w:p>
+        </w:tc>
+        <w:tc>
+          <w:tcPr>
+            <w:tcW w:type="dxa" w:w="5329"/>
+          </w:tcPr>
+          <w:p>
+            <w:pPr>
+              <w:pStyle w:val="TableText"/>
+            </w:pPr>
+            <w:r>
+              <w:t>8.2 GitOps</w:t>
+            </w:r>
+          </w:p>
+        </w:tc>
+        <w:tc>
+          <w:tcPr>
+            <w:tcW w:type="dxa" w:w="1928"/>
+          </w:tcPr>
+          <w:p>
+            <w:pPr>
+              <w:pStyle w:val="TableText"/>
+            </w:pPr>
+            <w:r>
+              <w:t>Recommended</w:t>
+            </w:r>
+          </w:p>
+        </w:tc>
+      </w:tr>
+      <w:tr>
+        <w:trPr>
+          <w:cantSplit/>
+        </w:trPr>
+        <w:tc>
+          <w:tcPr>
+            <w:tcW w:type="dxa" w:w="1814"/>
+            <w:shd w:val="clear" w:color="auto" w:fill="F2F5FA"/>
+          </w:tcPr>
+          <w:p>
+            <w:pPr>
+              <w:pStyle w:val="TableText"/>
+            </w:pPr>
+            <w:r>
+              <w:rPr>
+                <w:b/>
+              </w:rPr>
               <w:t>GW-CFG-005</w:t>
             </w:r>
           </w:p>
@@ -21484,7 +21802,7 @@
               <w:pStyle w:val="TableText"/>
             </w:pPr>
             <w:r>
-              <w:t>Recommended</w:t>
+              <w:t>Mandatory</w:t>
             </w:r>
           </w:p>
         </w:tc>
@@ -24298,7 +24616,7 @@
               <w:pStyle w:val="TableText"/>
             </w:pPr>
             <w:r>
-              <w:t>Capability enablement</w:t>
+              <w:t>Governance body</w:t>
             </w:r>
           </w:p>
         </w:tc>
@@ -24311,7 +24629,7 @@
               <w:pStyle w:val="TableText"/>
             </w:pPr>
             <w:r>
-              <w:t>Confirm which capabilities are optional per API and which are mandatory guardrails for every API (for example rate limiting, caching and schema validation).</w:t>
+              <w:t>Define the organizational governance body, including its owner and mandate. Until then the Infrastructure Team provides interim governance for the Platform, and the Security Managers approve exceptions.</w:t>
             </w:r>
           </w:p>
         </w:tc>
@@ -24324,190 +24642,7 @@
               <w:pStyle w:val="TableText"/>
             </w:pPr>
             <w:r>
-              <w:t>Section 1.4</w:t>
-            </w:r>
-          </w:p>
-        </w:tc>
-      </w:tr>
-      <w:tr>
-        <w:trPr>
-          <w:cantSplit/>
-        </w:trPr>
-        <w:tc>
-          <w:tcPr>
-            <w:tcW w:type="dxa" w:w="907"/>
-            <w:shd w:val="clear" w:color="auto" w:fill="F2F5FA"/>
-          </w:tcPr>
-          <w:p>
-            <w:pPr>
-              <w:pStyle w:val="TableText"/>
-            </w:pPr>
-            <w:r>
-              <w:rPr>
-                <w:b/>
-              </w:rPr>
-              <w:t>OI-02</w:t>
-            </w:r>
-          </w:p>
-        </w:tc>
-        <w:tc>
-          <w:tcPr>
-            <w:tcW w:type="dxa" w:w="1928"/>
-          </w:tcPr>
-          <w:p>
-            <w:pPr>
-              <w:pStyle w:val="TableText"/>
-            </w:pPr>
-            <w:r>
-              <w:t>Requirement levels</w:t>
-            </w:r>
-          </w:p>
-        </w:tc>
-        <w:tc>
-          <w:tcPr>
-            <w:tcW w:type="dxa" w:w="4649"/>
-          </w:tcPr>
-          <w:p>
-            <w:pPr>
-              <w:pStyle w:val="TableText"/>
-            </w:pPr>
-            <w:r>
-              <w:t>Review the requirements expressed as 'should', for example token-based B2B access, GitOps and the default retry position, to decide whether any should become 'shall'.</w:t>
-            </w:r>
-          </w:p>
-        </w:tc>
-        <w:tc>
-          <w:tcPr>
-            <w:tcW w:type="dxa" w:w="1587"/>
-          </w:tcPr>
-          <w:p>
-            <w:pPr>
-              <w:pStyle w:val="TableText"/>
-            </w:pPr>
-            <w:r>
-              <w:t>Section 1.4</w:t>
-            </w:r>
-          </w:p>
-        </w:tc>
-      </w:tr>
-      <w:tr>
-        <w:trPr>
-          <w:cantSplit/>
-        </w:trPr>
-        <w:tc>
-          <w:tcPr>
-            <w:tcW w:type="dxa" w:w="907"/>
-            <w:shd w:val="clear" w:color="auto" w:fill="F2F5FA"/>
-          </w:tcPr>
-          <w:p>
-            <w:pPr>
-              <w:pStyle w:val="TableText"/>
-            </w:pPr>
-            <w:r>
-              <w:rPr>
-                <w:b/>
-              </w:rPr>
-              <w:t>OI-03</w:t>
-            </w:r>
-          </w:p>
-        </w:tc>
-        <w:tc>
-          <w:tcPr>
-            <w:tcW w:type="dxa" w:w="1928"/>
-          </w:tcPr>
-          <w:p>
-            <w:pPr>
-              <w:pStyle w:val="TableText"/>
-            </w:pPr>
-            <w:r>
-              <w:t>Consumer configuration in Git</w:t>
-            </w:r>
-          </w:p>
-        </w:tc>
-        <w:tc>
-          <w:tcPr>
-            <w:tcW w:type="dxa" w:w="4649"/>
-          </w:tcPr>
-          <w:p>
-            <w:pPr>
-              <w:pStyle w:val="TableText"/>
-            </w:pPr>
-            <w:r>
-              <w:t>Define which consumer configuration is held in Git and which is managed at runtime.</w:t>
-            </w:r>
-          </w:p>
-        </w:tc>
-        <w:tc>
-          <w:tcPr>
-            <w:tcW w:type="dxa" w:w="1587"/>
-          </w:tcPr>
-          <w:p>
-            <w:pPr>
-              <w:pStyle w:val="TableText"/>
-            </w:pPr>
-            <w:r>
-              <w:t>Section 8.1</w:t>
-            </w:r>
-          </w:p>
-        </w:tc>
-      </w:tr>
-      <w:tr>
-        <w:trPr>
-          <w:cantSplit/>
-        </w:trPr>
-        <w:tc>
-          <w:tcPr>
-            <w:tcW w:type="dxa" w:w="907"/>
-            <w:shd w:val="clear" w:color="auto" w:fill="F2F5FA"/>
-          </w:tcPr>
-          <w:p>
-            <w:pPr>
-              <w:pStyle w:val="TableText"/>
-            </w:pPr>
-            <w:r>
-              <w:rPr>
-                <w:b/>
-              </w:rPr>
-              <w:t>OI-04</w:t>
-            </w:r>
-          </w:p>
-        </w:tc>
-        <w:tc>
-          <w:tcPr>
-            <w:tcW w:type="dxa" w:w="1928"/>
-          </w:tcPr>
-          <w:p>
-            <w:pPr>
-              <w:pStyle w:val="TableText"/>
-            </w:pPr>
-            <w:r>
-              <w:t>Governance body</w:t>
-            </w:r>
-          </w:p>
-        </w:tc>
-        <w:tc>
-          <w:tcPr>
-            <w:tcW w:type="dxa" w:w="4649"/>
-          </w:tcPr>
-          <w:p>
-            <w:pPr>
-              <w:pStyle w:val="TableText"/>
-            </w:pPr>
-            <w:r>
-              <w:t>Define the organizational governance body, including its owner and mandate. Until then the Infrastructure Team provides interim governance for the Platform.</w:t>
-            </w:r>
-          </w:p>
-        </w:tc>
-        <w:tc>
-          <w:tcPr>
-            <w:tcW w:type="dxa" w:w="1587"/>
-          </w:tcPr>
-          <w:p>
-            <w:pPr>
-              <w:pStyle w:val="TableText"/>
-            </w:pPr>
-            <w:r>
-              <w:t>Section 11.5</w:t>
+              <w:t>Section 11.5, 11.6</w:t>
             </w:r>
           </w:p>
         </w:tc>
@@ -24540,7 +24675,7 @@
       </w:pBdr>
     </w:pPr>
     <w:r>
-      <w:t>Version 1.0 — Draft</w:t>
+      <w:t>Version 1.2 — Draft</w:t>
     </w:r>
     <w:r>
       <w:tab/>
@@ -24577,7 +24712,7 @@
       </w:pBdr>
     </w:pPr>
     <w:r>
-      <w:t>Version 1.0 — Draft</w:t>
+      <w:t>Version 1.2 — Draft</w:t>
     </w:r>
     <w:r>
       <w:tab/>

</xml_diff>

<commit_message>
API Gateway standard v1.4 (English and Hebrew working copies)
Review decisions: scope is the API Gateway for web traffic only; authorization,
version routing, API contract, Developer Portal and metrics back to "should";
health checks must for HTTP, should for other technologies; consumers can be
created at runtime; TLS required from consumers to the Gateway; retention set
by the organization; exceptions are time-limited. Cover page filled in and the
document ID removed. Hebrew edition keeps secrets, claims, audit, guardrails and
governance in English. Build supports archiving the Hebrew edition.

Not archived under versions/ yet.

Co-Authored-By: Claude Sonnet 5 <noreply@anthropic.com>
</commit_message>
<xml_diff>
--- a/apps/api-gateway-doc/API_Gateway_Enterprise_Architecture_Standard.docx
+++ b/apps/api-gateway-doc/API_Gateway_Enterprise_Architecture_Standard.docx
@@ -13,9 +13,8 @@
           <w:b/>
           <w:color w:val="595959"/>
           <w:sz w:val="28"/>
-          <w:highlight w:val="yellow"/>
         </w:rPr>
-        <w:t>[Organization Name]</w:t>
+        <w:t>the Organization</w:t>
       </w:r>
     </w:p>
     <w:p>
@@ -101,7 +100,7 @@
               <w:pStyle w:val="TableText"/>
             </w:pPr>
             <w:r>
-              <w:t>1.3</w:t>
+              <w:t>1.4</w:t>
             </w:r>
           </w:p>
         </w:tc>
@@ -171,7 +170,7 @@
               <w:pStyle w:val="TableText"/>
             </w:pPr>
             <w:r>
-              <w:t>22 September 2026</w:t>
+              <w:t>23 September 2026</w:t>
             </w:r>
           </w:p>
         </w:tc>
@@ -193,7 +192,7 @@
               <w:rPr>
                 <w:b/>
               </w:rPr>
-              <w:t>Document ID</w:t>
+              <w:t>Classification</w:t>
             </w:r>
           </w:p>
         </w:tc>
@@ -206,48 +205,7 @@
               <w:pStyle w:val="TableText"/>
             </w:pPr>
             <w:r>
-              <w:rPr>
-                <w:highlight w:val="yellow"/>
-              </w:rPr>
-              <w:t>[Document ID]</w:t>
-            </w:r>
-          </w:p>
-        </w:tc>
-      </w:tr>
-      <w:tr>
-        <w:trPr>
-          <w:cantSplit/>
-        </w:trPr>
-        <w:tc>
-          <w:tcPr>
-            <w:tcW w:type="dxa" w:w="2268"/>
-            <w:shd w:val="clear" w:color="auto" w:fill="F2F5FA"/>
-          </w:tcPr>
-          <w:p>
-            <w:pPr>
-              <w:pStyle w:val="TableText"/>
-            </w:pPr>
-            <w:r>
-              <w:rPr>
-                <w:b/>
-              </w:rPr>
-              <w:t>Classification</w:t>
-            </w:r>
-          </w:p>
-        </w:tc>
-        <w:tc>
-          <w:tcPr>
-            <w:tcW w:type="dxa" w:w="4535"/>
-          </w:tcPr>
-          <w:p>
-            <w:pPr>
-              <w:pStyle w:val="TableText"/>
-            </w:pPr>
-            <w:r>
-              <w:rPr>
-                <w:highlight w:val="yellow"/>
-              </w:rPr>
-              <w:t>[Classification]</w:t>
+              <w:t>Unclassified</w:t>
             </w:r>
           </w:p>
         </w:tc>
@@ -343,7 +301,7 @@
               <w:rPr>
                 <w:b/>
               </w:rPr>
-              <w:t>Document ID</w:t>
+              <w:t>Version</w:t>
             </w:r>
           </w:p>
         </w:tc>
@@ -356,10 +314,7 @@
               <w:pStyle w:val="TableText"/>
             </w:pPr>
             <w:r>
-              <w:rPr>
-                <w:highlight w:val="yellow"/>
-              </w:rPr>
-              <w:t>[Document ID]</w:t>
+              <w:t>1.4</w:t>
             </w:r>
           </w:p>
         </w:tc>
@@ -381,7 +336,7 @@
               <w:rPr>
                 <w:b/>
               </w:rPr>
-              <w:t>Version</w:t>
+              <w:t>Status</w:t>
             </w:r>
           </w:p>
         </w:tc>
@@ -394,7 +349,7 @@
               <w:pStyle w:val="TableText"/>
             </w:pPr>
             <w:r>
-              <w:t>1.3</w:t>
+              <w:t>Draft</w:t>
             </w:r>
           </w:p>
         </w:tc>
@@ -416,7 +371,7 @@
               <w:rPr>
                 <w:b/>
               </w:rPr>
-              <w:t>Status</w:t>
+              <w:t>Classification</w:t>
             </w:r>
           </w:p>
         </w:tc>
@@ -429,7 +384,7 @@
               <w:pStyle w:val="TableText"/>
             </w:pPr>
             <w:r>
-              <w:t>Draft</w:t>
+              <w:t>Unclassified</w:t>
             </w:r>
           </w:p>
         </w:tc>
@@ -451,7 +406,7 @@
               <w:rPr>
                 <w:b/>
               </w:rPr>
-              <w:t>Classification</w:t>
+              <w:t>Document owner</w:t>
             </w:r>
           </w:p>
         </w:tc>
@@ -464,10 +419,7 @@
               <w:pStyle w:val="TableText"/>
             </w:pPr>
             <w:r>
-              <w:rPr>
-                <w:highlight w:val="yellow"/>
-              </w:rPr>
-              <w:t>[Classification]</w:t>
+              <w:t>Perimeter</w:t>
             </w:r>
           </w:p>
         </w:tc>
@@ -489,7 +441,7 @@
               <w:rPr>
                 <w:b/>
               </w:rPr>
-              <w:t>Document owner</w:t>
+              <w:t>Author</w:t>
             </w:r>
           </w:p>
         </w:tc>
@@ -502,48 +454,7 @@
               <w:pStyle w:val="TableText"/>
             </w:pPr>
             <w:r>
-              <w:rPr>
-                <w:highlight w:val="yellow"/>
-              </w:rPr>
-              <w:t>[Document owner, Infrastructure Team]</w:t>
-            </w:r>
-          </w:p>
-        </w:tc>
-      </w:tr>
-      <w:tr>
-        <w:trPr>
-          <w:cantSplit/>
-        </w:trPr>
-        <w:tc>
-          <w:tcPr>
-            <w:tcW w:type="dxa" w:w="2608"/>
-            <w:shd w:val="clear" w:color="auto" w:fill="F2F5FA"/>
-          </w:tcPr>
-          <w:p>
-            <w:pPr>
-              <w:pStyle w:val="TableText"/>
-            </w:pPr>
-            <w:r>
-              <w:rPr>
-                <w:b/>
-              </w:rPr>
-              <w:t>Author</w:t>
-            </w:r>
-          </w:p>
-        </w:tc>
-        <w:tc>
-          <w:tcPr>
-            <w:tcW w:type="dxa" w:w="6463"/>
-          </w:tcPr>
-          <w:p>
-            <w:pPr>
-              <w:pStyle w:val="TableText"/>
-            </w:pPr>
-            <w:r>
-              <w:rPr>
-                <w:highlight w:val="yellow"/>
-              </w:rPr>
-              <w:t>[Author]</w:t>
+              <w:t>Chaim Mendelson</w:t>
             </w:r>
           </w:p>
         </w:tc>
@@ -789,6 +700,63 @@
               <w:pStyle w:val="TableText"/>
             </w:pPr>
             <w:r>
+              <w:t>1.4</w:t>
+            </w:r>
+          </w:p>
+        </w:tc>
+        <w:tc>
+          <w:tcPr>
+            <w:tcW w:type="dxa" w:w="1587"/>
+          </w:tcPr>
+          <w:p>
+            <w:pPr>
+              <w:pStyle w:val="TableText"/>
+            </w:pPr>
+            <w:r>
+              <w:t>2026-09-23</w:t>
+            </w:r>
+          </w:p>
+        </w:tc>
+        <w:tc>
+          <w:tcPr>
+            <w:tcW w:type="dxa" w:w="2041"/>
+          </w:tcPr>
+          <w:p>
+            <w:pPr>
+              <w:pStyle w:val="TableText"/>
+            </w:pPr>
+            <w:r>
+              <w:t>Chaim Mendelson</w:t>
+            </w:r>
+          </w:p>
+        </w:tc>
+        <w:tc>
+          <w:tcPr>
+            <w:tcW w:type="dxa" w:w="4195"/>
+          </w:tcPr>
+          <w:p>
+            <w:pPr>
+              <w:pStyle w:val="TableText"/>
+            </w:pPr>
+            <w:r>
+              <w:t>Draft. Review decisions: scope stated as an API Gateway for web traffic only; authorization, version routing, API contract, Developer Portal and metrics changed from must to should; health checks required for HTTP and recommended for other technologies; consumers can be created at runtime; TLS required for consumer traffic to the Gateway; retention defined by the organization; exceptions are time-limited; cover-page details filled in and the document ID removed.</w:t>
+            </w:r>
+          </w:p>
+        </w:tc>
+      </w:tr>
+      <w:tr>
+        <w:trPr>
+          <w:cantSplit/>
+        </w:trPr>
+        <w:tc>
+          <w:tcPr>
+            <w:tcW w:type="dxa" w:w="1247"/>
+          </w:tcPr>
+          <w:p>
+            <w:pPr>
+              <w:pStyle w:val="TableText"/>
+            </w:pPr>
+            <w:r>
               <w:t>1.3</w:t>
             </w:r>
           </w:p>
@@ -2485,16 +2453,7 @@
     </w:p>
     <w:p>
       <w:r>
-        <w:t xml:space="preserve">This document sets out the enterprise architecture and operating model of the API Gateway platform of </w:t>
-      </w:r>
-      <w:r>
-        <w:rPr>
-          <w:highlight w:val="yellow"/>
-        </w:rPr>
-        <w:t>[Organization Name]</w:t>
-      </w:r>
-      <w:r>
-        <w:t>. It is the reference for the design and operation of the platform, for the application teams that expose APIs through it, and for the security, risk, audit and governance functions that oversee it.</w:t>
+        <w:t>This document sets out the enterprise architecture and operating model of the API Gateway platform of the Organization. It is the reference for the design and operation of the platform, for the application teams that expose APIs through it, and for the security, risk, audit and governance functions that oversee it.</w:t>
       </w:r>
     </w:p>
     <w:p>
@@ -2525,7 +2484,7 @@
     </w:p>
     <w:p>
       <w:r>
-        <w:t>The Gateway handles web traffic to backend services. The scope is deliberately defined as web traffic, not as a fixed list of protocols, so that the architecture is not coupled to any one application protocol. The platform is intended to support HTTP/HTTPS, GraphQL, gRPC and MCP, together with other web-based API technologies. WebSocket and streaming traffic, service-to-service (east-west) traffic, multi-tenant use of the platform and non-production environments are also within scope. SOAP is outside the scope of this document.</w:t>
+        <w:t>The scope of this document is the API Gateway for web traffic to backend services. The scope is defined as web traffic, not as a list of protocols or environments, so that the architecture is not coupled to any one application protocol or deployment.</w:t>
       </w:r>
     </w:p>
     <w:p>
@@ -3306,16 +3265,7 @@
               <w:pStyle w:val="TableText"/>
             </w:pPr>
             <w:r>
-              <w:t xml:space="preserve">The team </w:t>
-            </w:r>
-            <w:r>
-              <w:rPr>
-                <w:highlight w:val="yellow"/>
-              </w:rPr>
-              <w:t>[team name]</w:t>
-            </w:r>
-            <w:r>
-              <w:t xml:space="preserve"> designated by the organization to approve exceptions to this document.</w:t>
+              <w:t>The team designated by the organization to approve exceptions to this document.</w:t>
             </w:r>
           </w:p>
         </w:tc>
@@ -6134,7 +6084,7 @@
     </w:p>
     <w:p>
       <w:r>
-        <w:t>The Gateway enforces authorization at the API and operation level. For example, a consumer can be allowed to call GET /customers and denied DELETE /customers. Gateway authorization decisions can be based on identity, groups, roles, claims, scopes, policies and consumer identity.</w:t>
+        <w:t>The Gateway should enforce authorization at the API and operation level. For example, a consumer can be allowed to call GET /customers and denied DELETE /customers. Gateway authorization decisions can be based on identity, groups, roles, claims, scopes, policies and consumer identity.</w:t>
       </w:r>
     </w:p>
     <w:p>
@@ -6180,7 +6130,7 @@
     </w:p>
     <w:p>
       <w:r>
-        <w:t>Routing between API versions is an important Gateway capability, and the Gateway provides the technical means to do it. For example, requests to /api/v1/customers can be routed to one backend and requests to /api/v2/customers to another. The decisions about versions stay with the Application Team, which decides which versions exist, which consumers use each one, and when a version is deprecated and retired.</w:t>
+        <w:t>Routing between API versions is an important Gateway capability, and the Gateway should provide the technical means to do it. For example, requests to /api/v1/customers can be routed to one backend and requests to /api/v2/customers to another. The decisions about versions stay with the Application Team, which decides which versions exist, which consumers use each one, and when a version is deprecated and retired.</w:t>
       </w:r>
     </w:p>
     <w:p>
@@ -6210,7 +6160,7 @@
     </w:p>
     <w:p>
       <w:r>
-        <w:t>The Gateway must be able to determine whether a backend is available before it routes traffic to it. It does this with regular health checks, which apply to the backends of all API technologies; no protocol-specific mechanism is defined. Health checking supports HTTP health endpoints, configurable intervals and timeouts, failure and recovery thresholds, and backend-specific configuration. The Application Team is responsible for exposing an appropriate health endpoint for its backend, and the Gateway uses the result to make its routing decisions.</w:t>
+        <w:t>The Gateway must be able to determine whether an HTTP backend is available before it routes traffic to it. It does this with regular health checks. For backends of other API technologies, such as gRPC, WebSocket and MCP, regular health checks are recommended. No protocol-specific mechanism is defined. Health checking supports HTTP health endpoints, configurable intervals and timeouts, failure and recovery thresholds, and backend-specific configuration. The Application Team is responsible for exposing an appropriate health endpoint for its backend, and the Gateway uses the result to make its routing decisions.</w:t>
       </w:r>
     </w:p>
     <w:p>
@@ -6357,7 +6307,7 @@
     </w:p>
     <w:p>
       <w:r>
-        <w:t>Every API must have a defined technical contract, and the contract should be version controlled as part of the API lifecycle. It should describe the endpoints, methods, parameters, headers, request and response schemas, error responses, authentication and authorization requirements, and versions.</w:t>
+        <w:t>Every API should have a defined technical contract, and the contract should be version controlled as part of the API lifecycle. It should describe the endpoints, methods, parameters, headers, request and response schemas, error responses, authentication and authorization requirements, and versions.</w:t>
       </w:r>
     </w:p>
     <w:p>
@@ -6487,7 +6437,7 @@
     </w:p>
     <w:p>
       <w:r>
-        <w:t>The Platform provides a Developer Portal. The portal should offer API discovery, documentation, versions, authentication and authorization requirements, usage information and access-request information, and it should give clear instructions on how to obtain authorization to consume an API. How credentials are issued or access is granted depends on the organization's implementation and is not inherently a responsibility of the Gateway. The API owner is responsible for the accuracy of the API documentation.</w:t>
+        <w:t>The Platform should provide a Developer Portal. The portal should offer API discovery, documentation, versions, authentication and authorization requirements, usage information and access-request information, and it should give clear instructions on how to obtain authorization to consume an API. How credentials are issued or access is granted depends on the organization's implementation and is not inherently a responsibility of the Gateway. The API owner is responsible for the accuracy of the API documentation.</w:t>
       </w:r>
     </w:p>
     <w:p>
@@ -6513,7 +6463,7 @@
     </w:p>
     <w:p>
       <w:r>
-        <w:t>API configuration is synchronized with Git, and Git is the source of truth for API definitions, routes, policies, Gateway configuration, version configuration and consumer configuration. Consumer configuration means the consumer's identity, its entitlements (the APIs and operations it can use) and its rate limits. Consumer credentials are never held in Git; see Section 8.3. Direct manual changes to production Gateway configuration should be avoided. Working from Git provides change history, review, auditability, rollback, reproducibility and consistency between environments.</w:t>
+        <w:t>API configuration is synchronized with Git, and Git is the source of truth for API definitions, routes, policies, Gateway configuration, version configuration and consumer configuration. Consumer configuration means the consumer's identity, its entitlements (the APIs and operations it can use) and its rate limits. Consumers can also be created at runtime, for example through the Developer Portal. Consumer credentials are never held in Git; see Section 8.3. Direct manual changes to production Gateway configuration should be avoided. Working from Git provides change history, review, auditability, rollback, reproducibility and consistency between environments.</w:t>
       </w:r>
     </w:p>
     <w:p>
@@ -6654,7 +6604,7 @@
     </w:p>
     <w:p>
       <w:r>
-        <w:t>The Gateway exposes metrics for request volume, error rate, latency, backend latency, availability, rate limiting, authentication failures, authorization failures, backend failures and Gateway health. Metrics should be available by API, operation, consumer, backend and environment.</w:t>
+        <w:t>The Gateway should expose metrics for request volume, error rate, latency, backend latency, availability, rate limiting, authentication failures, authorization failures, backend failures and Gateway health. Metrics should be available by API, operation, consumer, backend and environment.</w:t>
       </w:r>
     </w:p>
     <w:p>
@@ -6669,7 +6619,7 @@
     </w:p>
     <w:p>
       <w:r>
-        <w:t>Audit logging is mandatory for all administrative and configuration activities. An audit record states who performed the action, what was changed, when it was changed, and which API or configuration was affected. Audit logs are sent to a centralized system outside the direct control of the person performing the operation. Two complementary sources of evidence exist for every change: Git shows what change was requested and approved, and the Gateway audit shows what was actually changed or executed. No retention period is defined for runtime logs or audit logs.</w:t>
+        <w:t>Audit logging is mandatory for all administrative and configuration activities. An audit record states who performed the action, what was changed, when it was changed, and which API or configuration was affected. Audit logs are sent to a centralized system outside the direct control of the person performing the operation. Two complementary sources of evidence exist for every change: Git shows what change was requested and approved, and the Gateway audit shows what was actually changed or executed. The retention period for runtime logs and audit logs is defined by the organization.</w:t>
       </w:r>
     </w:p>
     <w:p>
@@ -6867,7 +6817,7 @@
     </w:p>
     <w:p>
       <w:r>
-        <w:t>Requirements that are suited to technical enforcement should be implemented as mandatory Gateway guardrails. Examples are HTTPS at required boundaries, authentication, required logging, a maximum request size and mandatory organizational policies. Communication within the cluster, including between the Gateway and backend services, uses HTTP. No minimum TLS version and no maximum request size are defined by this document.</w:t>
+        <w:t>Requirements that are suited to technical enforcement should be implemented as mandatory Gateway guardrails. Examples are HTTPS at required boundaries, authentication, required logging, a maximum request size and mandatory organizational policies. Traffic from consumers to the Gateway must use TLS. Communication within the cluster, including between the Gateway and backend services, uses HTTP. No minimum TLS version and no maximum request size are defined by this document.</w:t>
       </w:r>
     </w:p>
     <w:p>
@@ -6927,7 +6877,7 @@
     </w:p>
     <w:p>
       <w:r>
-        <w:t>The Platform should support a controlled exception mechanism. An exception should have a documented reason, an identified owner, approval from the Security Managers, a statement of the risks involved, and an expiration or review date where appropriate. Exceptions should not become an alternative to proper architecture.</w:t>
+        <w:t>The Platform should support a controlled exception mechanism. An exception must have a documented reason, an identified owner, approval from the Security Managers, a statement of the risks involved, and an expiration or review date. An exception is time-limited: at that date it expires, or it is reviewed and renewed. Exceptions should not become an alternative to proper architecture.</w:t>
       </w:r>
     </w:p>
     <w:p>
@@ -7574,6 +7524,15 @@
       </w:r>
       <w:r>
         <w:t xml:space="preserve"> means that the Platform provides the capability and the Application Team decides whether to enable it for a given API. </w:t>
+      </w:r>
+      <w:r>
+        <w:rPr>
+          <w:b/>
+        </w:rPr>
+        <w:t>Recommended</w:t>
+      </w:r>
+      <w:r>
+        <w:t xml:space="preserve"> means that the Platform should provide the capability. </w:t>
       </w:r>
       <w:r>
         <w:rPr>
@@ -7776,7 +7735,7 @@
               <w:pStyle w:val="TableText"/>
             </w:pPr>
             <w:r>
-              <w:t>Required</w:t>
+              <w:t>Recommended</w:t>
             </w:r>
           </w:p>
         </w:tc>
@@ -8016,7 +7975,7 @@
               <w:pStyle w:val="TableText"/>
             </w:pPr>
             <w:r>
-              <w:t>Required</w:t>
+              <w:t>Recommended</w:t>
             </w:r>
           </w:p>
         </w:tc>
@@ -8256,7 +8215,7 @@
               <w:pStyle w:val="TableText"/>
             </w:pPr>
             <w:r>
-              <w:t>Required</w:t>
+              <w:t>Recommended</w:t>
             </w:r>
           </w:p>
         </w:tc>
@@ -8304,7 +8263,7 @@
               <w:pStyle w:val="TableText"/>
             </w:pPr>
             <w:r>
-              <w:t>Required</w:t>
+              <w:t>Recommended</w:t>
             </w:r>
           </w:p>
         </w:tc>
@@ -8544,7 +8503,7 @@
               <w:pStyle w:val="TableText"/>
             </w:pPr>
             <w:r>
-              <w:t>Required</w:t>
+              <w:t>Recommended</w:t>
             </w:r>
           </w:p>
         </w:tc>
@@ -9087,7 +9046,7 @@
       </w:pBdr>
     </w:pPr>
     <w:r>
-      <w:t>Version 1.3 — Draft</w:t>
+      <w:t>Version 1.4 — Draft</w:t>
     </w:r>
     <w:r>
       <w:tab/>
@@ -9124,7 +9083,7 @@
       </w:pBdr>
     </w:pPr>
     <w:r>
-      <w:t>Version 1.3 — Draft</w:t>
+      <w:t>Version 1.4 — Draft</w:t>
     </w:r>
     <w:r>
       <w:tab/>
@@ -9185,10 +9144,7 @@
       <w:tab/>
     </w:r>
     <w:r>
-      <w:rPr>
-        <w:highlight w:val="yellow"/>
-      </w:rPr>
-      <w:t>[Classification]</w:t>
+      <w:t>Unclassified</w:t>
     </w:r>
   </w:p>
 </w:hdr>

</xml_diff>